<commit_message>
revision: response letter — add KIMST funding row to Summary-of-Changes
Adds a row in the Summary-of-Changes table for the newly added KIMST
grant (RS-2026-25536446, Jeonbuk-Jeonnam Sea Grant) that covered the
additional computational analyses performed during revision. Points to
the Acknowledgement / Funding paragraph in the main text.

Cover letter is not touched (user is handling that separately).

Co-Authored-By: Claude Opus 4.7 (1M context) <noreply@anthropic.com>
</commit_message>
<xml_diff>
--- a/docs/revision/response_letter.docx
+++ b/docs/revision/response_letter.docx
@@ -6442,6 +6442,100 @@
                 <w:szCs w:val="18"/>
               </w:rPr>
               <w:t xml:space="preserve">M10; EN</w:t>
+            </w:r>
+          </w:p>
+        </w:tc>
+      </w:tr>
+      <w:tr>
+        <w:tc>
+          <w:tcPr>
+            <w:tcW w:type="dxa" w:w="4400"/>
+            <w:tcBorders>
+              <w:top w:val="single" w:color="BFBFBF" w:sz="1"/>
+              <w:left w:val="single" w:color="BFBFBF" w:sz="1"/>
+              <w:bottom w:val="single" w:color="BFBFBF" w:sz="1"/>
+              <w:right w:val="single" w:color="BFBFBF" w:sz="1"/>
+            </w:tcBorders>
+            <w:tcMar>
+              <w:top w:type="dxa" w:w="80"/>
+              <w:left w:type="dxa" w:w="100"/>
+              <w:bottom w:type="dxa" w:w="80"/>
+              <w:right w:type="dxa" w:w="100"/>
+            </w:tcMar>
+          </w:tcPr>
+          <w:p>
+            <w:pPr>
+              <w:jc w:val="left"/>
+            </w:pPr>
+            <w:r>
+              <w:rPr>
+                <w:rFonts w:ascii="Arial" w:cs="Arial" w:eastAsia="Arial" w:hAnsi="Arial"/>
+                <w:sz w:val="18"/>
+                <w:szCs w:val="18"/>
+              </w:rPr>
+              <w:t xml:space="preserve">Funding statement — added KIMST grant (RS-2026-25536446, Jeonbuk–Jeonnam Sea Grant) covering the additional computational analyses performed during revision</w:t>
+            </w:r>
+          </w:p>
+        </w:tc>
+        <w:tc>
+          <w:tcPr>
+            <w:tcW w:type="dxa" w:w="2960"/>
+            <w:tcBorders>
+              <w:top w:val="single" w:color="BFBFBF" w:sz="1"/>
+              <w:left w:val="single" w:color="BFBFBF" w:sz="1"/>
+              <w:bottom w:val="single" w:color="BFBFBF" w:sz="1"/>
+              <w:right w:val="single" w:color="BFBFBF" w:sz="1"/>
+            </w:tcBorders>
+            <w:tcMar>
+              <w:top w:type="dxa" w:w="80"/>
+              <w:left w:type="dxa" w:w="100"/>
+              <w:bottom w:type="dxa" w:w="80"/>
+              <w:right w:type="dxa" w:w="100"/>
+            </w:tcMar>
+          </w:tcPr>
+          <w:p>
+            <w:pPr>
+              <w:jc w:val="left"/>
+            </w:pPr>
+            <w:r>
+              <w:rPr>
+                <w:rFonts w:ascii="Arial" w:cs="Arial" w:eastAsia="Arial" w:hAnsi="Arial"/>
+                <w:sz w:val="18"/>
+                <w:szCs w:val="18"/>
+              </w:rPr>
+              <w:t xml:space="preserve">Main text — Acknowledgement / Funding [Line XXX]</w:t>
+            </w:r>
+          </w:p>
+        </w:tc>
+        <w:tc>
+          <w:tcPr>
+            <w:tcW w:type="dxa" w:w="2000"/>
+            <w:tcBorders>
+              <w:top w:val="single" w:color="BFBFBF" w:sz="1"/>
+              <w:left w:val="single" w:color="BFBFBF" w:sz="1"/>
+              <w:bottom w:val="single" w:color="BFBFBF" w:sz="1"/>
+              <w:right w:val="single" w:color="BFBFBF" w:sz="1"/>
+            </w:tcBorders>
+            <w:tcMar>
+              <w:top w:type="dxa" w:w="80"/>
+              <w:left w:type="dxa" w:w="100"/>
+              <w:bottom w:type="dxa" w:w="80"/>
+              <w:right w:type="dxa" w:w="100"/>
+            </w:tcMar>
+          </w:tcPr>
+          <w:p>
+            <w:pPr>
+              <w:jc w:val="left"/>
+            </w:pPr>
+            <w:r>
+              <w:rPr>
+                <w:rFonts w:ascii="Arial" w:cs="Arial" w:eastAsia="Arial" w:hAnsi="Arial"/>
+                <w:b/>
+                <w:bCs/>
+                <w:sz w:val="18"/>
+                <w:szCs w:val="18"/>
+              </w:rPr>
+              <w:t xml:space="preserve">(editor housekeeping H_FUNDING)</w:t>
             </w:r>
           </w:p>
         </w:tc>

</xml_diff>